<commit_message>
commited 12th may assignment wordgame level2
</commit_message>
<xml_diff>
--- a/Day 12 May 11th/SimpleNotificationSystem/Vaibhav Gupta_ADO - Changing the data tier Assigment.docx
+++ b/Day 12 May 11th/SimpleNotificationSystem/Vaibhav Gupta_ADO - Changing the data tier Assigment.docx
@@ -40,11 +40,43 @@
         <w:rPr>
           <w:noProof/>
         </w:rPr>
-        <w:t>Github Link: Link</w:t>
+        <w:t xml:space="preserve">Github Link: </w:t>
+      </w:r>
+      <w:hyperlink r:id="rId5" w:history="1">
+        <w:r>
+          <w:rPr>
+            <w:rStyle w:val="Hyperlink"/>
+            <w:noProof/>
+          </w:rPr>
+          <w:t>Lin</w:t>
+        </w:r>
+        <w:r>
+          <w:rPr>
+            <w:rStyle w:val="Hyperlink"/>
+            <w:noProof/>
+          </w:rPr>
+          <w:t>k</w:t>
+        </w:r>
+      </w:hyperlink>
+    </w:p>
+    <w:p>
+      <w:pPr>
+        <w:rPr>
+          <w:noProof/>
+        </w:rPr>
+      </w:pPr>
+      <w:r>
+        <w:rPr>
+          <w:noProof/>
+        </w:rPr>
+        <w:t>https://github.com/114-Vaibhav/genspark/tree/main/Day%2012%20May%2011th/SimpleNotificationSystem</w:t>
       </w:r>
     </w:p>
     <w:p>
       <w:r>
+        <w:rPr>
+          <w:noProof/>
+        </w:rPr>
         <w:lastRenderedPageBreak/>
         <w:drawing>
           <wp:inline distT="0" distB="0" distL="0" distR="0" wp14:anchorId="1DF4F274" wp14:editId="025A1B09">
@@ -59,50 +91,6 @@
                 <pic:pic xmlns:pic="http://schemas.openxmlformats.org/drawingml/2006/picture">
                   <pic:nvPicPr>
                     <pic:cNvPr id="2116178559" name=""/>
-                    <pic:cNvPicPr/>
-                  </pic:nvPicPr>
-                  <pic:blipFill>
-                    <a:blip r:embed="rId5"/>
-                    <a:stretch>
-                      <a:fillRect/>
-                    </a:stretch>
-                  </pic:blipFill>
-                  <pic:spPr>
-                    <a:xfrm>
-                      <a:off x="0" y="0"/>
-                      <a:ext cx="5943600" cy="7136130"/>
-                    </a:xfrm>
-                    <a:prstGeom prst="rect">
-                      <a:avLst/>
-                    </a:prstGeom>
-                  </pic:spPr>
-                </pic:pic>
-              </a:graphicData>
-            </a:graphic>
-          </wp:inline>
-        </w:drawing>
-      </w:r>
-      <w:r>
-        <w:rPr>
-          <w:noProof/>
-        </w:rPr>
-        <w:t xml:space="preserve"> </w:t>
-      </w:r>
-      <w:r>
-        <w:lastRenderedPageBreak/>
-        <w:drawing>
-          <wp:inline distT="0" distB="0" distL="0" distR="0" wp14:anchorId="33D2C05D" wp14:editId="08C46CB9">
-            <wp:extent cx="5943600" cy="7136130"/>
-            <wp:effectExtent l="0" t="0" r="0" b="1270"/>
-            <wp:docPr id="1140409537" name="Picture 1"/>
-            <wp:cNvGraphicFramePr>
-              <a:graphicFrameLocks xmlns:a="http://schemas.openxmlformats.org/drawingml/2006/main" noChangeAspect="1"/>
-            </wp:cNvGraphicFramePr>
-            <a:graphic xmlns:a="http://schemas.openxmlformats.org/drawingml/2006/main">
-              <a:graphicData uri="http://schemas.openxmlformats.org/drawingml/2006/picture">
-                <pic:pic xmlns:pic="http://schemas.openxmlformats.org/drawingml/2006/picture">
-                  <pic:nvPicPr>
-                    <pic:cNvPr id="1140409537" name=""/>
                     <pic:cNvPicPr/>
                   </pic:nvPicPr>
                   <pic:blipFill>
@@ -138,10 +126,10 @@
         </w:rPr>
         <w:lastRenderedPageBreak/>
         <w:drawing>
-          <wp:inline distT="0" distB="0" distL="0" distR="0" wp14:anchorId="62CB791F" wp14:editId="54A6314C">
+          <wp:inline distT="0" distB="0" distL="0" distR="0" wp14:anchorId="33D2C05D" wp14:editId="08C46CB9">
             <wp:extent cx="5943600" cy="7136130"/>
             <wp:effectExtent l="0" t="0" r="0" b="1270"/>
-            <wp:docPr id="641697158" name="Picture 1"/>
+            <wp:docPr id="1140409537" name="Picture 1"/>
             <wp:cNvGraphicFramePr>
               <a:graphicFrameLocks xmlns:a="http://schemas.openxmlformats.org/drawingml/2006/main" noChangeAspect="1"/>
             </wp:cNvGraphicFramePr>
@@ -149,7 +137,7 @@
               <a:graphicData uri="http://schemas.openxmlformats.org/drawingml/2006/picture">
                 <pic:pic xmlns:pic="http://schemas.openxmlformats.org/drawingml/2006/picture">
                   <pic:nvPicPr>
-                    <pic:cNvPr id="641697158" name=""/>
+                    <pic:cNvPr id="1140409537" name=""/>
                     <pic:cNvPicPr/>
                   </pic:nvPicPr>
                   <pic:blipFill>
@@ -185,10 +173,10 @@
         </w:rPr>
         <w:lastRenderedPageBreak/>
         <w:drawing>
-          <wp:inline distT="0" distB="0" distL="0" distR="0" wp14:anchorId="48900E65" wp14:editId="1409F45F">
+          <wp:inline distT="0" distB="0" distL="0" distR="0" wp14:anchorId="62CB791F" wp14:editId="54A6314C">
             <wp:extent cx="5943600" cy="7136130"/>
             <wp:effectExtent l="0" t="0" r="0" b="1270"/>
-            <wp:docPr id="1082322575" name="Picture 1"/>
+            <wp:docPr id="641697158" name="Picture 1"/>
             <wp:cNvGraphicFramePr>
               <a:graphicFrameLocks xmlns:a="http://schemas.openxmlformats.org/drawingml/2006/main" noChangeAspect="1"/>
             </wp:cNvGraphicFramePr>
@@ -196,7 +184,7 @@
               <a:graphicData uri="http://schemas.openxmlformats.org/drawingml/2006/picture">
                 <pic:pic xmlns:pic="http://schemas.openxmlformats.org/drawingml/2006/picture">
                   <pic:nvPicPr>
-                    <pic:cNvPr id="1082322575" name=""/>
+                    <pic:cNvPr id="641697158" name=""/>
                     <pic:cNvPicPr/>
                   </pic:nvPicPr>
                   <pic:blipFill>
@@ -232,10 +220,10 @@
         </w:rPr>
         <w:lastRenderedPageBreak/>
         <w:drawing>
-          <wp:inline distT="0" distB="0" distL="0" distR="0" wp14:anchorId="4782EE0C" wp14:editId="35344410">
+          <wp:inline distT="0" distB="0" distL="0" distR="0" wp14:anchorId="48900E65" wp14:editId="1409F45F">
             <wp:extent cx="5943600" cy="7136130"/>
             <wp:effectExtent l="0" t="0" r="0" b="1270"/>
-            <wp:docPr id="458681451" name="Picture 1"/>
+            <wp:docPr id="1082322575" name="Picture 1"/>
             <wp:cNvGraphicFramePr>
               <a:graphicFrameLocks xmlns:a="http://schemas.openxmlformats.org/drawingml/2006/main" noChangeAspect="1"/>
             </wp:cNvGraphicFramePr>
@@ -243,7 +231,7 @@
               <a:graphicData uri="http://schemas.openxmlformats.org/drawingml/2006/picture">
                 <pic:pic xmlns:pic="http://schemas.openxmlformats.org/drawingml/2006/picture">
                   <pic:nvPicPr>
-                    <pic:cNvPr id="458681451" name=""/>
+                    <pic:cNvPr id="1082322575" name=""/>
                     <pic:cNvPicPr/>
                   </pic:nvPicPr>
                   <pic:blipFill>
@@ -279,6 +267,53 @@
         </w:rPr>
         <w:lastRenderedPageBreak/>
         <w:drawing>
+          <wp:inline distT="0" distB="0" distL="0" distR="0" wp14:anchorId="4782EE0C" wp14:editId="35344410">
+            <wp:extent cx="5943600" cy="7136130"/>
+            <wp:effectExtent l="0" t="0" r="0" b="1270"/>
+            <wp:docPr id="458681451" name="Picture 1"/>
+            <wp:cNvGraphicFramePr>
+              <a:graphicFrameLocks xmlns:a="http://schemas.openxmlformats.org/drawingml/2006/main" noChangeAspect="1"/>
+            </wp:cNvGraphicFramePr>
+            <a:graphic xmlns:a="http://schemas.openxmlformats.org/drawingml/2006/main">
+              <a:graphicData uri="http://schemas.openxmlformats.org/drawingml/2006/picture">
+                <pic:pic xmlns:pic="http://schemas.openxmlformats.org/drawingml/2006/picture">
+                  <pic:nvPicPr>
+                    <pic:cNvPr id="458681451" name=""/>
+                    <pic:cNvPicPr/>
+                  </pic:nvPicPr>
+                  <pic:blipFill>
+                    <a:blip r:embed="rId10"/>
+                    <a:stretch>
+                      <a:fillRect/>
+                    </a:stretch>
+                  </pic:blipFill>
+                  <pic:spPr>
+                    <a:xfrm>
+                      <a:off x="0" y="0"/>
+                      <a:ext cx="5943600" cy="7136130"/>
+                    </a:xfrm>
+                    <a:prstGeom prst="rect">
+                      <a:avLst/>
+                    </a:prstGeom>
+                  </pic:spPr>
+                </pic:pic>
+              </a:graphicData>
+            </a:graphic>
+          </wp:inline>
+        </w:drawing>
+      </w:r>
+      <w:r>
+        <w:rPr>
+          <w:noProof/>
+        </w:rPr>
+        <w:t xml:space="preserve"> </w:t>
+      </w:r>
+      <w:r>
+        <w:rPr>
+          <w:noProof/>
+        </w:rPr>
+        <w:lastRenderedPageBreak/>
+        <w:drawing>
           <wp:inline distT="0" distB="0" distL="0" distR="0" wp14:anchorId="34652675" wp14:editId="6EECA7FC">
             <wp:extent cx="5943600" cy="7136130"/>
             <wp:effectExtent l="0" t="0" r="0" b="1270"/>
@@ -294,7 +329,7 @@
                     <pic:cNvPicPr/>
                   </pic:nvPicPr>
                   <pic:blipFill>
-                    <a:blip r:embed="rId10"/>
+                    <a:blip r:embed="rId11"/>
                     <a:stretch>
                       <a:fillRect/>
                     </a:stretch>
@@ -1265,6 +1300,18 @@
       <w:shd w:val="clear" w:color="auto" w:fill="E1DFDD"/>
     </w:rPr>
   </w:style>
+  <w:style w:type="character" w:styleId="FollowedHyperlink">
+    <w:name w:val="FollowedHyperlink"/>
+    <w:basedOn w:val="DefaultParagraphFont"/>
+    <w:uiPriority w:val="99"/>
+    <w:semiHidden/>
+    <w:unhideWhenUsed/>
+    <w:rsid w:val="00802A10"/>
+    <w:rPr>
+      <w:color w:val="96607D" w:themeColor="followedHyperlink"/>
+      <w:u w:val="single"/>
+    </w:rPr>
+  </w:style>
 </w:styles>
 </file>
 

</xml_diff>